<commit_message>
Fix DOCX contract field filling
</commit_message>
<xml_diff>
--- a/contract-pdf-work/templates/Umowa_Zamowienia_Pojazdu_AG_template_signed.docx
+++ b/contract-pdf-work/templates/Umowa_Zamowienia_Pojazdu_AG_template_signed.docx
@@ -5033,47 +5033,47 @@
             </w:pPr>
           </w:p>
           <w:p>
-            <w:pPr>
-              <w:ind w:left="-111" w:firstLine="111"/>
-              <w:jc w:val="center"/>
-              <w:cnfStyle w:val="000000000000" w:firstRow="0" w:lastRow="0" w:firstColumn="0" w:lastColumn="0" w:oddVBand="0" w:evenVBand="0" w:oddHBand="0" w:evenHBand="0" w:firstRowFirstColumn="0" w:firstRowLastColumn="0" w:lastRowFirstColumn="0" w:lastRowLastColumn="0"/>
-              <w:rPr>
-                <w:rFonts w:ascii="Calibri" w:hAnsi="Calibri"/>
-                <w:sz w:val="16"/>
-              </w:rPr>
-            </w:pPr>
             <w:r>
               <w:drawing>
-                <wp:inline xmlns:a="http://schemas.openxmlformats.org/drawingml/2006/main" xmlns:pic="http://schemas.openxmlformats.org/drawingml/2006/picture">
-                  <wp:extent cx="1417320" cy="868004"/>
-                  <wp:docPr id="1549759869" name="Picture 1549759869"/>
+                <wp:anchor distT="0" distB="0" distL="0" distR="0" simplePos="0" relativeHeight="251659264" behindDoc="0" locked="0" layoutInCell="1" allowOverlap="1">
+                  <wp:simplePos x="0" y="0"/>
+                  <wp:positionH relativeFrom="column">
+                    <wp:align>center</wp:align>
+                  </wp:positionH>
+                  <wp:positionV relativeFrom="paragraph">
+                    <wp:posOffset>0</wp:posOffset>
+                  </wp:positionV>
+                  <wp:extent cx="1417320" cy="887688"/>
+                  <wp:effectExtent l="0" t="0" r="0" b="0"/>
+                  <wp:wrapNone/>
+                  <wp:docPr id="2001" name="AUTOGOOD stamp"/>
                   <wp:cNvGraphicFramePr>
-                    <a:graphicFrameLocks noChangeAspect="1"/>
+                    <ns0:graphicFrameLocks xmlns:ns0="http://schemas.openxmlformats.org/drawingml/2006/main" noChangeAspect="1"/>
                   </wp:cNvGraphicFramePr>
-                  <a:graphic>
-                    <a:graphicData uri="http://schemas.openxmlformats.org/drawingml/2006/picture">
-                      <pic:pic>
-                        <pic:nvPicPr>
-                          <pic:cNvPr id="0" name="autogood-stamp.jpg"/>
-                          <pic:cNvPicPr/>
-                        </pic:nvPicPr>
-                        <pic:blipFill>
-                          <a:blip r:embed="rId15"/>
-                          <a:stretch>
-                            <a:fillRect/>
-                          </a:stretch>
-                        </pic:blipFill>
-                        <pic:spPr>
-                          <a:xfrm>
-                            <a:off x="0" y="0"/>
-                            <a:ext cx="1417320" cy="868004"/>
-                          </a:xfrm>
-                          <a:prstGeom prst="rect"/>
-                        </pic:spPr>
-                      </pic:pic>
-                    </a:graphicData>
-                  </a:graphic>
-                </wp:inline>
+                  <ns1:graphic xmlns:ns1="http://schemas.openxmlformats.org/drawingml/2006/main">
+                    <ns1:graphicData uri="http://schemas.openxmlformats.org/drawingml/2006/picture">
+                      <ns2:pic xmlns:ns2="http://schemas.openxmlformats.org/drawingml/2006/picture">
+                        <ns2:nvPicPr>
+                          <ns2:cNvPr id="0" name="autogood-stamp.jpg"/>
+                          <ns2:cNvPicPr/>
+                        </ns2:nvPicPr>
+                        <ns2:blipFill>
+                          <ns1:blip r:embed="rId15"/>
+                          <ns1:stretch>
+                            <ns1:fillRect/>
+                          </ns1:stretch>
+                        </ns2:blipFill>
+                        <ns2:spPr>
+                          <ns1:xfrm>
+                            <ns1:off x="0" y="0"/>
+                            <ns1:ext cx="1417320" cy="887688"/>
+                          </ns1:xfrm>
+                          <ns1:prstGeom prst="rect"/>
+                        </ns2:spPr>
+                      </ns2:pic>
+                    </ns1:graphicData>
+                  </ns1:graphic>
+                </wp:anchor>
               </w:drawing>
             </w:r>
           </w:p>

</xml_diff>

<commit_message>
Update contract filename and stamp size
</commit_message>
<xml_diff>
--- a/contract-pdf-work/templates/Umowa_Zamowienia_Pojazdu_AG_template_signed.docx
+++ b/contract-pdf-work/templates/Umowa_Zamowienia_Pojazdu_AG_template_signed.docx
@@ -5043,7 +5043,7 @@
                   <wp:positionV relativeFrom="paragraph">
                     <wp:posOffset>0</wp:posOffset>
                   </wp:positionV>
-                  <wp:extent cx="1417320" cy="887688"/>
+                  <wp:extent cx="1207000" cy="755800"/>
                   <wp:effectExtent l="0" t="0" r="0" b="0"/>
                   <wp:wrapNone/>
                   <wp:docPr id="2001" name="AUTOGOOD stamp"/>
@@ -5066,7 +5066,7 @@
                         <ns2:spPr>
                           <ns1:xfrm>
                             <ns1:off x="0" y="0"/>
-                            <ns1:ext cx="1417320" cy="887688"/>
+                            <ns1:ext cx="1207000" cy="755800"/>
                           </ns1:xfrm>
                           <ns1:prstGeom prst="rect"/>
                         </ns2:spPr>

</xml_diff>

<commit_message>
Refine contract DOCX layout
</commit_message>
<xml_diff>
--- a/contract-pdf-work/templates/Umowa_Zamowienia_Pojazdu_AG_template_signed.docx
+++ b/contract-pdf-work/templates/Umowa_Zamowienia_Pojazdu_AG_template_signed.docx
@@ -1,6 +1,6 @@
 
 <file path=word/document.xml><?xml version="1.0" encoding="utf-8"?>
-<w:document xmlns:wpc="http://schemas.microsoft.com/office/word/2010/wordprocessingCanvas" xmlns:cx="http://schemas.microsoft.com/office/drawing/2014/chartex" xmlns:cx1="http://schemas.microsoft.com/office/drawing/2015/9/8/chartex" xmlns:cx2="http://schemas.microsoft.com/office/drawing/2015/10/21/chartex" xmlns:cx3="http://schemas.microsoft.com/office/drawing/2016/5/9/chartex" xmlns:cx4="http://schemas.microsoft.com/office/drawing/2016/5/10/chartex" xmlns:cx5="http://schemas.microsoft.com/office/drawing/2016/5/11/chartex" xmlns:cx6="http://schemas.microsoft.com/office/drawing/2016/5/12/chartex" xmlns:cx7="http://schemas.microsoft.com/office/drawing/2016/5/13/chartex" xmlns:cx8="http://schemas.microsoft.com/office/drawing/2016/5/14/chartex" xmlns:mc="http://schemas.openxmlformats.org/markup-compatibility/2006" xmlns:aink="http://schemas.microsoft.com/office/drawing/2016/ink" xmlns:am3d="http://schemas.microsoft.com/office/drawing/2017/model3d" xmlns:o="urn:schemas-microsoft-com:office:office" xmlns:oel="http://schemas.microsoft.com/office/2019/extlst" xmlns:r="http://schemas.openxmlformats.org/officeDocument/2006/relationships" xmlns:m="http://schemas.openxmlformats.org/officeDocument/2006/math" xmlns:v="urn:schemas-microsoft-com:vml" xmlns:wp14="http://schemas.microsoft.com/office/word/2010/wordprocessingDrawing" xmlns:wp="http://schemas.openxmlformats.org/drawingml/2006/wordprocessingDrawing" xmlns:w10="urn:schemas-microsoft-com:office:word" xmlns:w="http://schemas.openxmlformats.org/wordprocessingml/2006/main" xmlns:w14="http://schemas.microsoft.com/office/word/2010/wordml" xmlns:w15="http://schemas.microsoft.com/office/word/2012/wordml" xmlns:w16cex="http://schemas.microsoft.com/office/word/2018/wordml/cex" xmlns:w16cid="http://schemas.microsoft.com/office/word/2016/wordml/cid" xmlns:w16="http://schemas.microsoft.com/office/word/2018/wordml" xmlns:w16sdtdh="http://schemas.microsoft.com/office/word/2020/wordml/sdtdatahash" xmlns:w16se="http://schemas.microsoft.com/office/word/2015/wordml/symex" xmlns:wpg="http://schemas.microsoft.com/office/word/2010/wordprocessingGroup" xmlns:wpi="http://schemas.microsoft.com/office/word/2010/wordprocessingInk" xmlns:wne="http://schemas.microsoft.com/office/word/2006/wordml" xmlns:wps="http://schemas.microsoft.com/office/word/2010/wordprocessingShape" mc:Ignorable="w14 w15 w16se w16cid w16 w16cex w16sdtdh wp14">
+<w:document xmlns:mc="http://schemas.openxmlformats.org/markup-compatibility/2006" xmlns:ns5="http://schemas.openxmlformats.org/drawingml/2006/main" xmlns:ns6="http://schemas.openxmlformats.org/drawingml/2006/picture" xmlns:ns8="http://schemas.microsoft.com/office/drawing/2010/main" xmlns:r="http://schemas.openxmlformats.org/officeDocument/2006/relationships" xmlns:w="http://schemas.openxmlformats.org/wordprocessingml/2006/main" xmlns:w14="http://schemas.microsoft.com/office/word/2010/wordml" xmlns:wp="http://schemas.openxmlformats.org/drawingml/2006/wordprocessingDrawing" xmlns:wp14="http://schemas.microsoft.com/office/word/2010/wordprocessingDrawing" mc:Ignorable="w14 w15 w16se w16cid w16 w16cex w16sdtdh wp14">
   <w:body>
     <w:p>
       <w:pPr>
@@ -174,6 +174,7 @@
             <w:gridSpan w:val="2"/>
             <w:tcBorders>
               <w:bottom w:val="single" w:sz="2" w:space="0" w:color="9CC2E5" w:themeColor="accent5" w:themeTint="99"/>
+              <w:left w:val="single" w:sz="2" w:space="0" w:color="9CC2E5" w:themeColor="accent5" w:themeTint="99"/>
             </w:tcBorders>
             <w:shd w:val="clear" w:color="auto" w:fill="0070C0"/>
           </w:tcPr>
@@ -227,6 +228,9 @@
             <w:tcW w:w="4819" w:type="dxa"/>
             <w:gridSpan w:val="3"/>
             <w:shd w:val="clear" w:color="auto" w:fill="0070C0"/>
+            <w:tcBorders>
+              <w:right w:val="single" w:sz="2" w:space="0" w:color="9CC2E5" w:themeColor="accent5" w:themeTint="99"/>
+            </w:tcBorders>
           </w:tcPr>
           <w:p>
             <w:pPr>
@@ -459,6 +463,9 @@
             <w:tcW w:w="4819" w:type="dxa"/>
             <w:gridSpan w:val="3"/>
             <w:shd w:val="clear" w:color="auto" w:fill="auto"/>
+            <w:tcBorders>
+              <w:right w:val="single" w:sz="2" w:space="0" w:color="9CC2E5" w:themeColor="accent5" w:themeTint="99"/>
+            </w:tcBorders>
           </w:tcPr>
           <w:p>
             <w:pPr>
@@ -480,45 +487,45 @@
                   <wp:effectExtent l="0" t="0" r="4445" b="0"/>
                   <wp:docPr id="1549759868" name="Obraz 1"/>
                   <wp:cNvGraphicFramePr>
-                    <a:graphicFrameLocks xmlns:a="http://schemas.openxmlformats.org/drawingml/2006/main" noChangeAspect="1"/>
+                    <ns5:graphicFrameLocks noChangeAspect="1"/>
                   </wp:cNvGraphicFramePr>
-                  <a:graphic xmlns:a="http://schemas.openxmlformats.org/drawingml/2006/main">
-                    <a:graphicData uri="http://schemas.openxmlformats.org/drawingml/2006/picture">
-                      <pic:pic xmlns:pic="http://schemas.openxmlformats.org/drawingml/2006/picture">
-                        <pic:nvPicPr>
-                          <pic:cNvPr id="1549759868" name="Picture 1"/>
-                          <pic:cNvPicPr>
-                            <a:picLocks noChangeAspect="1" noChangeArrowheads="1"/>
-                          </pic:cNvPicPr>
-                        </pic:nvPicPr>
-                        <pic:blipFill>
-                          <a:blip r:embed="rId8" r:link="rId9">
-                            <a:extLst>
-                              <a:ext uri="{28A0092B-C50C-407E-A947-70E740481C1C}">
-                                <a14:useLocalDpi xmlns:a14="http://schemas.microsoft.com/office/drawing/2010/main" val="0"/>
-                              </a:ext>
-                            </a:extLst>
-                          </a:blip>
-                          <a:stretch>
-                            <a:fillRect/>
-                          </a:stretch>
-                        </pic:blipFill>
-                        <pic:spPr bwMode="auto">
-                          <a:xfrm>
-                            <a:off x="0" y="0"/>
-                            <a:ext cx="2914215" cy="701773"/>
-                          </a:xfrm>
-                          <a:prstGeom prst="rect">
-                            <a:avLst/>
-                          </a:prstGeom>
-                          <a:noFill/>
-                          <a:ln>
-                            <a:noFill/>
-                          </a:ln>
-                        </pic:spPr>
-                      </pic:pic>
-                    </a:graphicData>
-                  </a:graphic>
+                  <ns5:graphic>
+                    <ns5:graphicData uri="http://schemas.openxmlformats.org/drawingml/2006/picture">
+                      <ns6:pic>
+                        <ns6:nvPicPr>
+                          <ns6:cNvPr id="1549759868" name="Picture 1"/>
+                          <ns6:cNvPicPr>
+                            <ns5:picLocks noChangeAspect="1" noChangeArrowheads="1"/>
+                          </ns6:cNvPicPr>
+                        </ns6:nvPicPr>
+                        <ns6:blipFill>
+                          <ns5:blip r:embed="rId8" r:link="rId9">
+                            <ns5:extLst>
+                              <ns5:ext uri="{28A0092B-C50C-407E-A947-70E740481C1C}">
+                                <ns8:useLocalDpi val="0"/>
+                              </ns5:ext>
+                            </ns5:extLst>
+                          </ns5:blip>
+                          <ns5:stretch>
+                            <ns5:fillRect/>
+                          </ns5:stretch>
+                        </ns6:blipFill>
+                        <ns6:spPr bwMode="auto">
+                          <ns5:xfrm>
+                            <ns5:off x="0" y="0"/>
+                            <ns5:ext cx="2914215" cy="701773"/>
+                          </ns5:xfrm>
+                          <ns5:prstGeom prst="rect">
+                            <ns5:avLst/>
+                          </ns5:prstGeom>
+                          <ns5:noFill/>
+                          <ns5:ln>
+                            <ns5:noFill/>
+                          </ns5:ln>
+                        </ns6:spPr>
+                      </ns6:pic>
+                    </ns5:graphicData>
+                  </ns5:graphic>
                 </wp:inline>
               </w:drawing>
             </w:r>
@@ -637,6 +644,9 @@
             <w:tcW w:w="4819" w:type="dxa"/>
             <w:gridSpan w:val="3"/>
             <w:shd w:val="clear" w:color="auto" w:fill="auto"/>
+            <w:tcBorders>
+              <w:right w:val="single" w:sz="2" w:space="0" w:color="9CC2E5" w:themeColor="accent5" w:themeTint="99"/>
+            </w:tcBorders>
           </w:tcPr>
           <w:p>
             <w:pPr>
@@ -948,6 +958,9 @@
             <w:tcW w:w="4819" w:type="dxa"/>
             <w:gridSpan w:val="3"/>
             <w:shd w:val="clear" w:color="auto" w:fill="auto"/>
+            <w:tcBorders>
+              <w:right w:val="single" w:sz="2" w:space="0" w:color="9CC2E5" w:themeColor="accent5" w:themeTint="99"/>
+            </w:tcBorders>
           </w:tcPr>
           <w:p>
             <w:pPr>
@@ -1198,6 +1211,9 @@
             <w:tcW w:w="4819" w:type="dxa"/>
             <w:gridSpan w:val="3"/>
             <w:shd w:val="clear" w:color="auto" w:fill="auto"/>
+            <w:tcBorders>
+              <w:right w:val="single" w:sz="2" w:space="0" w:color="9CC2E5" w:themeColor="accent5" w:themeTint="99"/>
+            </w:tcBorders>
           </w:tcPr>
           <w:p>
             <w:pPr>
@@ -1446,6 +1462,7 @@
             <w:gridSpan w:val="3"/>
             <w:tcBorders>
               <w:bottom w:val="single" w:sz="2" w:space="0" w:color="9CC2E5" w:themeColor="accent5" w:themeTint="99"/>
+              <w:right w:val="single" w:sz="2" w:space="0" w:color="9CC2E5" w:themeColor="accent5" w:themeTint="99"/>
             </w:tcBorders>
             <w:shd w:val="clear" w:color="auto" w:fill="0070C0"/>
           </w:tcPr>
@@ -1527,6 +1544,7 @@
             <w:vMerge w:val="restart"/>
             <w:tcBorders>
               <w:bottom w:val="single" w:sz="2" w:space="0" w:color="9CC2E5" w:themeColor="accent5" w:themeTint="99"/>
+              <w:right w:val="single" w:sz="2" w:space="0" w:color="9CC2E5" w:themeColor="accent5" w:themeTint="99"/>
             </w:tcBorders>
             <w:shd w:val="clear" w:color="auto" w:fill="auto"/>
           </w:tcPr>
@@ -1701,6 +1719,9 @@
             <w:gridSpan w:val="3"/>
             <w:vMerge/>
             <w:shd w:val="clear" w:color="auto" w:fill="auto"/>
+            <w:tcBorders>
+              <w:right w:val="single" w:sz="2" w:space="0" w:color="9CC2E5" w:themeColor="accent5" w:themeTint="99"/>
+            </w:tcBorders>
           </w:tcPr>
           <w:p>
             <w:pPr>
@@ -1813,7 +1834,7 @@
                 <w:sz w:val="16"/>
                 <w:szCs w:val="16"/>
               </w:rPr>
-              <w:t>w zakupie, w imieniu Zleceniodawcy</w:t>
+              <w:t xml:space="preserve">w zakupie, w imieniu Zleceniodawcy lub</w:t>
             </w:r>
           </w:p>
           <w:bookmarkStart w:id="5" w:name="OLE_LINK2"/>
@@ -2205,6 +2226,7 @@
             <w:gridSpan w:val="3"/>
             <w:tcBorders>
               <w:bottom w:val="single" w:sz="2" w:space="0" w:color="9CC2E5" w:themeColor="accent5" w:themeTint="99"/>
+              <w:right w:val="single" w:sz="2" w:space="0" w:color="9CC2E5" w:themeColor="accent5" w:themeTint="99"/>
             </w:tcBorders>
             <w:shd w:val="clear" w:color="auto" w:fill="auto"/>
           </w:tcPr>
@@ -3184,6 +3206,9 @@
             <w:tcW w:w="4819" w:type="dxa"/>
             <w:gridSpan w:val="3"/>
             <w:shd w:val="clear" w:color="auto" w:fill="auto"/>
+            <w:tcBorders>
+              <w:right w:val="single" w:sz="2" w:space="0" w:color="9CC2E5" w:themeColor="accent5" w:themeTint="99"/>
+            </w:tcBorders>
           </w:tcPr>
           <w:p>
             <w:pPr>
@@ -3396,6 +3421,9 @@
           <w:tcPr>
             <w:tcW w:w="4819" w:type="dxa"/>
             <w:gridSpan w:val="3"/>
+            <w:tcBorders>
+              <w:right w:val="single" w:sz="2" w:space="0" w:color="9CC2E5" w:themeColor="accent5" w:themeTint="99"/>
+            </w:tcBorders>
           </w:tcPr>
           <w:p>
             <w:pPr>
@@ -3600,6 +3628,9 @@
           <w:tcPr>
             <w:tcW w:w="4819" w:type="dxa"/>
             <w:gridSpan w:val="3"/>
+            <w:tcBorders>
+              <w:right w:val="single" w:sz="2" w:space="0" w:color="9CC2E5" w:themeColor="accent5" w:themeTint="99"/>
+            </w:tcBorders>
           </w:tcPr>
           <w:p>
             <w:pPr>
@@ -3979,6 +4010,9 @@
             <w:tcW w:w="4819" w:type="dxa"/>
             <w:gridSpan w:val="3"/>
             <w:vMerge w:val="restart"/>
+            <w:tcBorders>
+              <w:right w:val="single" w:sz="2" w:space="0" w:color="9CC2E5" w:themeColor="accent5" w:themeTint="99"/>
+            </w:tcBorders>
           </w:tcPr>
           <w:p>
             <w:pPr>
@@ -4230,7 +4264,7 @@
                 <w:sz w:val="16"/>
                 <w:szCs w:val="16"/>
               </w:rPr>
-              <w:t>% od ceny brutto pojazdu</w:t>
+              <w:t xml:space="preserve">% od ceny brutto pojazdu lub</w:t>
             </w:r>
             <w:r>
               <w:rPr>
@@ -4593,6 +4627,9 @@
             <w:gridSpan w:val="3"/>
             <w:vMerge/>
             <w:shd w:val="clear" w:color="auto" w:fill="auto"/>
+            <w:tcBorders>
+              <w:right w:val="single" w:sz="2" w:space="0" w:color="9CC2E5" w:themeColor="accent5" w:themeTint="99"/>
+            </w:tcBorders>
           </w:tcPr>
           <w:p>
             <w:pPr>
@@ -4656,6 +4693,9 @@
             <w:tcW w:w="4819" w:type="dxa"/>
             <w:gridSpan w:val="3"/>
             <w:shd w:val="clear" w:color="auto" w:fill="auto"/>
+            <w:tcBorders>
+              <w:right w:val="single" w:sz="2" w:space="0" w:color="9CC2E5" w:themeColor="accent5" w:themeTint="99"/>
+            </w:tcBorders>
           </w:tcPr>
           <w:p>
             <w:pPr>
@@ -4720,6 +4760,8 @@
             <w:gridSpan w:val="6"/>
             <w:tcBorders>
               <w:left w:val="single" w:sz="2" w:space="0" w:color="9CC2E5" w:themeColor="accent5" w:themeTint="99"/>
+              <w:right w:val="single" w:sz="2" w:space="0" w:color="9CC2E5" w:themeColor="accent5" w:themeTint="99"/>
+              <w:bottom w:val="single" w:sz="2" w:space="0" w:color="9CC2E5" w:themeColor="accent5" w:themeTint="99"/>
             </w:tcBorders>
             <w:shd w:val="clear" w:color="auto" w:fill="auto"/>
           </w:tcPr>
@@ -4868,6 +4910,11 @@
             <w:tcW w:w="4820" w:type="dxa"/>
             <w:gridSpan w:val="2"/>
             <w:shd w:val="clear" w:color="auto" w:fill="0070C0"/>
+            <w:tcBorders>
+              <w:left w:val="single" w:sz="2" w:space="0" w:color="9CC2E5" w:themeColor="accent5" w:themeTint="99"/>
+              <w:right w:val="single" w:sz="2" w:space="0" w:color="9CC2E5" w:themeColor="accent5" w:themeTint="99"/>
+              <w:bottom w:val="single" w:sz="2" w:space="0" w:color="9CC2E5" w:themeColor="accent5" w:themeTint="99"/>
+            </w:tcBorders>
           </w:tcPr>
           <w:p>
             <w:pPr>
@@ -4921,6 +4968,11 @@
             <w:tcW w:w="4809" w:type="dxa"/>
             <w:gridSpan w:val="2"/>
             <w:shd w:val="clear" w:color="auto" w:fill="0070C0"/>
+            <w:tcBorders>
+              <w:right w:val="single" w:sz="2" w:space="0" w:color="9CC2E5" w:themeColor="accent5" w:themeTint="99"/>
+              <w:left w:val="single" w:sz="2" w:space="0" w:color="9CC2E5" w:themeColor="accent5" w:themeTint="99"/>
+              <w:bottom w:val="single" w:sz="2" w:space="0" w:color="9CC2E5" w:themeColor="accent5" w:themeTint="99"/>
+            </w:tcBorders>
           </w:tcPr>
           <w:p>
             <w:pPr>
@@ -5048,31 +5100,31 @@
                   <wp:wrapNone/>
                   <wp:docPr id="2001" name="AUTOGOOD stamp"/>
                   <wp:cNvGraphicFramePr>
-                    <ns0:graphicFrameLocks xmlns:ns0="http://schemas.openxmlformats.org/drawingml/2006/main" noChangeAspect="1"/>
+                    <ns5:graphicFrameLocks noChangeAspect="1"/>
                   </wp:cNvGraphicFramePr>
-                  <ns1:graphic xmlns:ns1="http://schemas.openxmlformats.org/drawingml/2006/main">
-                    <ns1:graphicData uri="http://schemas.openxmlformats.org/drawingml/2006/picture">
-                      <ns2:pic xmlns:ns2="http://schemas.openxmlformats.org/drawingml/2006/picture">
-                        <ns2:nvPicPr>
-                          <ns2:cNvPr id="0" name="autogood-stamp.jpg"/>
-                          <ns2:cNvPicPr/>
-                        </ns2:nvPicPr>
-                        <ns2:blipFill>
-                          <ns1:blip r:embed="rId15"/>
-                          <ns1:stretch>
-                            <ns1:fillRect/>
-                          </ns1:stretch>
-                        </ns2:blipFill>
-                        <ns2:spPr>
-                          <ns1:xfrm>
-                            <ns1:off x="0" y="0"/>
-                            <ns1:ext cx="1207000" cy="755800"/>
-                          </ns1:xfrm>
-                          <ns1:prstGeom prst="rect"/>
-                        </ns2:spPr>
-                      </ns2:pic>
-                    </ns1:graphicData>
-                  </ns1:graphic>
+                  <ns5:graphic>
+                    <ns5:graphicData uri="http://schemas.openxmlformats.org/drawingml/2006/picture">
+                      <ns6:pic>
+                        <ns6:nvPicPr>
+                          <ns6:cNvPr id="0" name="autogood-stamp.jpg"/>
+                          <ns6:cNvPicPr/>
+                        </ns6:nvPicPr>
+                        <ns6:blipFill>
+                          <ns5:blip r:embed="rId15"/>
+                          <ns5:stretch>
+                            <ns5:fillRect/>
+                          </ns5:stretch>
+                        </ns6:blipFill>
+                        <ns6:spPr>
+                          <ns5:xfrm>
+                            <ns5:off x="0" y="0"/>
+                            <ns5:ext cx="1207000" cy="755800"/>
+                          </ns5:xfrm>
+                          <ns5:prstGeom prst="rect"/>
+                        </ns6:spPr>
+                      </ns6:pic>
+                    </ns5:graphicData>
+                  </ns5:graphic>
                 </wp:anchor>
               </w:drawing>
             </w:r>
@@ -5153,45 +5205,45 @@
             <wp:effectExtent l="0" t="0" r="635" b="0"/>
             <wp:docPr id="1012593150" name="Obraz 1"/>
             <wp:cNvGraphicFramePr>
-              <a:graphicFrameLocks xmlns:a="http://schemas.openxmlformats.org/drawingml/2006/main" noChangeAspect="1"/>
+              <ns5:graphicFrameLocks noChangeAspect="1"/>
             </wp:cNvGraphicFramePr>
-            <a:graphic xmlns:a="http://schemas.openxmlformats.org/drawingml/2006/main">
-              <a:graphicData uri="http://schemas.openxmlformats.org/drawingml/2006/picture">
-                <pic:pic xmlns:pic="http://schemas.openxmlformats.org/drawingml/2006/picture">
-                  <pic:nvPicPr>
-                    <pic:cNvPr id="1012593150" name="Picture 1"/>
-                    <pic:cNvPicPr>
-                      <a:picLocks noChangeAspect="1" noChangeArrowheads="1"/>
-                    </pic:cNvPicPr>
-                  </pic:nvPicPr>
-                  <pic:blipFill>
-                    <a:blip r:embed="rId8" r:link="rId9">
-                      <a:extLst>
-                        <a:ext uri="{28A0092B-C50C-407E-A947-70E740481C1C}">
-                          <a14:useLocalDpi xmlns:a14="http://schemas.microsoft.com/office/drawing/2010/main" val="0"/>
-                        </a:ext>
-                      </a:extLst>
-                    </a:blip>
-                    <a:stretch>
-                      <a:fillRect/>
-                    </a:stretch>
-                  </pic:blipFill>
-                  <pic:spPr bwMode="auto">
-                    <a:xfrm>
-                      <a:off x="0" y="0"/>
-                      <a:ext cx="2539365" cy="611505"/>
-                    </a:xfrm>
-                    <a:prstGeom prst="rect">
-                      <a:avLst/>
-                    </a:prstGeom>
-                    <a:noFill/>
-                    <a:ln>
-                      <a:noFill/>
-                    </a:ln>
-                  </pic:spPr>
-                </pic:pic>
-              </a:graphicData>
-            </a:graphic>
+            <ns5:graphic>
+              <ns5:graphicData uri="http://schemas.openxmlformats.org/drawingml/2006/picture">
+                <ns6:pic>
+                  <ns6:nvPicPr>
+                    <ns6:cNvPr id="1012593150" name="Picture 1"/>
+                    <ns6:cNvPicPr>
+                      <ns5:picLocks noChangeAspect="1" noChangeArrowheads="1"/>
+                    </ns6:cNvPicPr>
+                  </ns6:nvPicPr>
+                  <ns6:blipFill>
+                    <ns5:blip r:embed="rId8" r:link="rId9">
+                      <ns5:extLst>
+                        <ns5:ext uri="{28A0092B-C50C-407E-A947-70E740481C1C}">
+                          <ns8:useLocalDpi val="0"/>
+                        </ns5:ext>
+                      </ns5:extLst>
+                    </ns5:blip>
+                    <ns5:stretch>
+                      <ns5:fillRect/>
+                    </ns5:stretch>
+                  </ns6:blipFill>
+                  <ns6:spPr bwMode="auto">
+                    <ns5:xfrm>
+                      <ns5:off x="0" y="0"/>
+                      <ns5:ext cx="2539365" cy="611505"/>
+                    </ns5:xfrm>
+                    <ns5:prstGeom prst="rect">
+                      <ns5:avLst/>
+                    </ns5:prstGeom>
+                    <ns5:noFill/>
+                    <ns5:ln>
+                      <ns5:noFill/>
+                    </ns5:ln>
+                  </ns6:spPr>
+                </ns6:pic>
+              </ns5:graphicData>
+            </ns5:graphic>
           </wp:inline>
         </w:drawing>
       </w:r>

</xml_diff>